<commit_message>
Update contract overview baseline count
</commit_message>
<xml_diff>
--- a/docs/notes/VCL2FMXConverter_v5_Contract_System_Overview.docx
+++ b/docs/notes/VCL2FMXConverter_v5_Contract_System_Overview.docx
@@ -58,9 +58,14 @@
       </w:r>
     </w:p>
     <w:p>
-      <w:pPr/>
       <w:r>
-        <w:t>[v5.0 current contract baseline] The current v5.0 suite contains 188 executable expectations. The suite includes dry-run preview accounting, report-card layout, include analysis, Windows messaging categories, DFM/FMXL fidelity checks, semantic structure checks, mapping assistance, graphics/GDI handling, and protected uses cleanup.</w:t>
+        <w:t xml:space="preserve">[v5.0 current contract baseline] The </w:t>
+      </w:r>
+      <w:r>
+        <w:t>current v5.0 suite contains 194 executable expectations</w:t>
+      </w:r>
+      <w:r>
+        <w:t>. The suite includes dry-run preview accounting, report-card layout, include analysis, Windows messaging categories, DFM/FMXL fidelity checks, semantic structure checks, mapping assistance, graphics/GDI handling, and protected uses cleanup.</w:t>
       </w:r>
     </w:p>
     <w:p>
@@ -171,6 +176,7 @@
         <w:pStyle w:val="Heading1"/>
       </w:pPr>
       <w:r>
+        <w:lastRenderedPageBreak/>
         <w:t>What A Contract Contains</w:t>
       </w:r>
     </w:p>
@@ -397,6 +403,7 @@
         <w:pStyle w:val="Heading1"/>
       </w:pPr>
       <w:r>
+        <w:lastRenderedPageBreak/>
         <w:t>What The Contracts Do With Presented Data</w:t>
       </w:r>
     </w:p>

</xml_diff>